<commit_message>
[verified] Make portfolio links clickable in application documents
</commit_message>
<xml_diff>
--- a/application/Ho_Yeun_Jae_Nexovo_Cover_Letter.docx
+++ b/application/Ho_Yeun_Jae_Nexovo_Cover_Letter.docx
@@ -31,12 +31,16 @@
         <w:spacing w:after="260"/>
       </w:pPr>
       <w:r>
-        <w:rPr>
-          <w:b w:val="0"/>
-          <w:sz w:val="18"/>
-        </w:rPr>
-        <w:t>Portfolio: https://github.com/Molut/ai-automation-portfolio</w:t>
+        <w:t xml:space="preserve">Portfolio: </w:t>
       </w:r>
+      <w:hyperlink r:id="rId9">
+        <w:r>
+          <w:rPr>
+            <w:sz w:val="18"/>
+          </w:rPr>
+          <w:t>https://github.com/Molut/ai-automation-portfolio</w:t>
+        </w:r>
+      </w:hyperlink>
     </w:p>
     <w:p>
       <w:pPr>

</xml_diff>